<commit_message>
Corrige alinhamento das linhas de assinatura
</commit_message>
<xml_diff>
--- a/docs/Portfolio_TG_William_Honda.docx
+++ b/docs/Portfolio_TG_William_Honda.docx
@@ -1581,8 +1581,11 @@
           <w:between w:space="0" w:sz="0" w:val="nil"/>
         </w:pBdr>
         <w:shd w:fill="auto" w:val="clear"/>
+        <w:tabs>
+          <w:tab w:pos="8957" w:val="right" w:leader="underscore"/>
+        </w:tabs>
         <w:spacing w:after="0" w:before="0" w:line="240" w:lineRule="auto"/>
-        <w:ind w:left="4195" w:right="0" w:firstLine="357"/>
+        <w:ind w:left="4195" w:right="0" w:firstLine="0"/>
         <w:jc w:val="left"/>
         <w:rPr>
           <w:rFonts w:ascii="Times New Roman" w:cs="Times New Roman" w:eastAsia="Times New Roman" w:hAnsi="Times New Roman"/>
@@ -1616,7 +1619,7 @@
           <w:vertAlign w:val="baseline"/>
           <w:rtl w:val="0"/>
         </w:rPr>
-        <w:t xml:space="preserve">Orientador: __________________________________________</w:t>
+        <w:t xml:space="preserve">Orientador:	 </w:t>
       </w:r>
       <w:r>
         <w:rPr>
@@ -2570,21 +2573,28 @@
     </w:p>
     <w:p>
       <w:pPr>
-        <w:ind w:firstLine="288"/>
-        <w:jc w:val="center"/>
-        <w:rPr>
-          <w:b w:val="1"/>
-          <w:bCs w:val="1"/>
-        </w:rPr>
-      </w:pPr>
-      <w:r>
-        <w:rPr>
-          <w:b w:val="1"/>
-          <w:bCs w:val="1"/>
-          <w:color w:val="000000"/>
-          <w:rtl w:val="0"/>
-        </w:rPr>
-        <w:t xml:space="preserve">__________________________________________________________________</w:t>
+        <w:spacing w:before="0" w:after="0" w:line="240" w:lineRule="auto"/>
+        <w:ind w:left="709" w:right="709" w:firstLine="0"/>
+        <w:jc w:val="center"/>
+        <w:rPr>
+          <w:b w:val="1"/>
+          <w:bCs w:val="1"/>
+        </w:rPr>
+        <w:pBdr>
+          <w:bottom w:val="single" w:sz="4" w:space="0" w:color="000000"/>
+        </w:pBdr>
+      </w:pPr>
+      <w:r>
+        <w:rPr>
+          <w:rFonts w:ascii="Times New Roman" w:hAnsi="Times New Roman" w:eastAsia="Times New Roman" w:cs="Times New Roman"/>
+          <w:b w:val="0"/>
+          <w:bCs w:val="1"/>
+          <w:i w:val="0"/>
+          <w:color w:val="000000"/>
+          <w:sz w:val="24"/>
+          <w:rtl w:val="0"/>
+        </w:rPr>
+        <w:t xml:space="preserve"> </w:t>
       </w:r>
     </w:p>
     <w:p>
@@ -2635,21 +2645,28 @@
     </w:p>
     <w:p>
       <w:pPr>
-        <w:ind w:firstLine="288"/>
-        <w:jc w:val="center"/>
-        <w:rPr>
-          <w:b w:val="1"/>
-          <w:bCs w:val="1"/>
-        </w:rPr>
-      </w:pPr>
-      <w:r>
-        <w:rPr>
-          <w:b w:val="1"/>
-          <w:bCs w:val="1"/>
-          <w:color w:val="000000"/>
-          <w:rtl w:val="0"/>
-        </w:rPr>
-        <w:t xml:space="preserve">___________________________________________________________________</w:t>
+        <w:spacing w:before="0" w:after="0" w:line="240" w:lineRule="auto"/>
+        <w:ind w:left="709" w:right="709" w:firstLine="0"/>
+        <w:jc w:val="center"/>
+        <w:rPr>
+          <w:b w:val="1"/>
+          <w:bCs w:val="1"/>
+        </w:rPr>
+        <w:pBdr>
+          <w:bottom w:val="single" w:sz="4" w:space="0" w:color="000000"/>
+        </w:pBdr>
+      </w:pPr>
+      <w:r>
+        <w:rPr>
+          <w:rFonts w:ascii="Times New Roman" w:hAnsi="Times New Roman" w:eastAsia="Times New Roman" w:cs="Times New Roman"/>
+          <w:b w:val="0"/>
+          <w:bCs w:val="1"/>
+          <w:i w:val="0"/>
+          <w:color w:val="000000"/>
+          <w:sz w:val="24"/>
+          <w:rtl w:val="0"/>
+        </w:rPr>
+        <w:t xml:space="preserve"> </w:t>
       </w:r>
     </w:p>
     <w:p>
@@ -2703,21 +2720,28 @@
     </w:p>
     <w:p>
       <w:pPr>
-        <w:ind w:firstLine="288"/>
-        <w:jc w:val="center"/>
-        <w:rPr>
-          <w:b w:val="1"/>
-          <w:bCs w:val="1"/>
-        </w:rPr>
-      </w:pPr>
-      <w:r>
-        <w:rPr>
-          <w:b w:val="1"/>
-          <w:bCs w:val="1"/>
-          <w:color w:val="000000"/>
-          <w:rtl w:val="0"/>
-        </w:rPr>
-        <w:t xml:space="preserve">__________________________________________________________________</w:t>
+        <w:spacing w:before="0" w:after="0" w:line="240" w:lineRule="auto"/>
+        <w:ind w:left="709" w:right="709" w:firstLine="0"/>
+        <w:jc w:val="center"/>
+        <w:rPr>
+          <w:b w:val="1"/>
+          <w:bCs w:val="1"/>
+        </w:rPr>
+        <w:pBdr>
+          <w:bottom w:val="single" w:sz="4" w:space="0" w:color="000000"/>
+        </w:pBdr>
+      </w:pPr>
+      <w:r>
+        <w:rPr>
+          <w:rFonts w:ascii="Times New Roman" w:hAnsi="Times New Roman" w:eastAsia="Times New Roman" w:cs="Times New Roman"/>
+          <w:b w:val="0"/>
+          <w:bCs w:val="1"/>
+          <w:i w:val="0"/>
+          <w:color w:val="000000"/>
+          <w:sz w:val="24"/>
+          <w:rtl w:val="0"/>
+        </w:rPr>
+        <w:t xml:space="preserve"> </w:t>
       </w:r>
     </w:p>
     <w:p>
@@ -2771,21 +2795,28 @@
     </w:p>
     <w:p>
       <w:pPr>
-        <w:ind w:firstLine="288"/>
-        <w:jc w:val="center"/>
-        <w:rPr>
-          <w:b w:val="1"/>
-          <w:bCs w:val="1"/>
-        </w:rPr>
-      </w:pPr>
-      <w:r>
-        <w:rPr>
-          <w:b w:val="1"/>
-          <w:bCs w:val="1"/>
-          <w:color w:val="000000"/>
-          <w:rtl w:val="0"/>
-        </w:rPr>
-        <w:t xml:space="preserve">__________________________________________________________________</w:t>
+        <w:spacing w:before="0" w:after="0" w:line="240" w:lineRule="auto"/>
+        <w:ind w:left="709" w:right="709" w:firstLine="0"/>
+        <w:jc w:val="center"/>
+        <w:rPr>
+          <w:b w:val="1"/>
+          <w:bCs w:val="1"/>
+        </w:rPr>
+        <w:pBdr>
+          <w:bottom w:val="single" w:sz="4" w:space="0" w:color="000000"/>
+        </w:pBdr>
+      </w:pPr>
+      <w:r>
+        <w:rPr>
+          <w:rFonts w:ascii="Times New Roman" w:hAnsi="Times New Roman" w:eastAsia="Times New Roman" w:cs="Times New Roman"/>
+          <w:b w:val="0"/>
+          <w:bCs w:val="1"/>
+          <w:i w:val="0"/>
+          <w:color w:val="000000"/>
+          <w:sz w:val="24"/>
+          <w:rtl w:val="0"/>
+        </w:rPr>
+        <w:t xml:space="preserve"> </w:t>
       </w:r>
     </w:p>
     <w:p>

</xml_diff>

<commit_message>
Centraliza elementos pré-textuais na página
</commit_message>
<xml_diff>
--- a/docs/Portfolio_TG_William_Honda.docx
+++ b/docs/Portfolio_TG_William_Honda.docx
@@ -4,7 +4,7 @@
   <w:body>
     <w:p>
       <w:pPr>
-        <w:ind w:firstLine="288"/>
+        <w:ind w:left="-283" w:right="283" w:firstLine="0"/>
         <w:jc w:val="center"/>
         <w:rPr>
           <w:b w:val="1"/>
@@ -31,7 +31,7 @@
     </w:p>
     <w:p>
       <w:pPr>
-        <w:ind w:firstLine="288"/>
+        <w:ind w:left="-283" w:right="283" w:firstLine="0"/>
         <w:jc w:val="center"/>
         <w:rPr>
           <w:b w:val="1"/>
@@ -189,7 +189,7 @@
     </w:p>
     <w:p>
       <w:pPr>
-        <w:ind w:firstLine="288"/>
+        <w:ind w:left="-283" w:right="283" w:firstLine="0"/>
         <w:jc w:val="center"/>
         <w:rPr>
           <w:b w:val="1"/>
@@ -374,7 +374,7 @@
         </w:pBdr>
         <w:shd w:fill="auto" w:val="clear"/>
         <w:spacing w:after="0" w:before="0" w:line="240" w:lineRule="auto"/>
-        <w:ind w:left="288" w:right="0" w:firstLine="0"/>
+        <w:ind w:left="-283" w:right="283" w:firstLine="0"/>
         <w:jc w:val="center"/>
         <w:rPr>
           <w:rFonts w:ascii="Times New Roman" w:cs="Times New Roman" w:eastAsia="Times New Roman" w:hAnsi="Times New Roman"/>
@@ -426,7 +426,7 @@
         </w:pBdr>
         <w:shd w:fill="auto" w:val="clear"/>
         <w:spacing w:after="0" w:before="0" w:line="240" w:lineRule="auto"/>
-        <w:ind w:left="288" w:right="0" w:firstLine="0"/>
+        <w:ind w:left="-283" w:right="283" w:firstLine="0"/>
         <w:jc w:val="center"/>
         <w:rPr>
           <w:rFonts w:ascii="Times New Roman" w:cs="Times New Roman" w:eastAsia="Times New Roman" w:hAnsi="Times New Roman"/>
@@ -478,7 +478,7 @@
         </w:pBdr>
         <w:shd w:fill="auto" w:val="clear"/>
         <w:spacing w:after="0" w:before="0" w:line="240" w:lineRule="auto"/>
-        <w:ind w:left="288" w:right="0" w:firstLine="0"/>
+        <w:ind w:left="-283" w:right="283" w:firstLine="0"/>
         <w:jc w:val="center"/>
         <w:rPr>
           <w:rFonts w:ascii="Times New Roman" w:cs="Times New Roman" w:eastAsia="Times New Roman" w:hAnsi="Times New Roman"/>
@@ -858,7 +858,7 @@
         <w:tabs>
           <w:tab w:val="left" w:leader="none" w:pos="5949"/>
         </w:tabs>
-        <w:ind w:firstLine="288"/>
+        <w:ind w:left="-283" w:right="283" w:firstLine="0"/>
         <w:jc w:val="center"/>
         <w:rPr>
           <w:sz w:val="28"/>
@@ -883,7 +883,7 @@
         <w:tabs>
           <w:tab w:val="left" w:leader="none" w:pos="5949"/>
         </w:tabs>
-        <w:ind w:firstLine="288"/>
+        <w:ind w:left="-283" w:right="283" w:firstLine="0"/>
         <w:jc w:val="center"/>
         <w:rPr>
           <w:sz w:val="28"/>
@@ -964,7 +964,7 @@
     </w:p>
     <w:p>
       <w:pPr>
-        <w:ind w:firstLine="288"/>
+        <w:ind w:left="-283" w:right="283" w:firstLine="0"/>
         <w:jc w:val="center"/>
         <w:rPr>
           <w:b w:val="1"/>
@@ -1105,7 +1105,7 @@
         </w:pBdr>
         <w:shd w:fill="auto" w:val="clear"/>
         <w:spacing w:after="0" w:before="0" w:line="240" w:lineRule="auto"/>
-        <w:ind w:left="288" w:right="0" w:firstLine="0"/>
+        <w:ind w:left="-283" w:right="283" w:firstLine="0"/>
         <w:jc w:val="center"/>
         <w:rPr>
           <w:rFonts w:ascii="Times New Roman" w:cs="Times New Roman" w:eastAsia="Times New Roman" w:hAnsi="Times New Roman"/>
@@ -1157,7 +1157,7 @@
         </w:pBdr>
         <w:shd w:fill="auto" w:val="clear"/>
         <w:spacing w:after="0" w:before="0" w:line="240" w:lineRule="auto"/>
-        <w:ind w:left="288" w:right="0" w:firstLine="0"/>
+        <w:ind w:left="-283" w:right="283" w:firstLine="0"/>
         <w:jc w:val="center"/>
         <w:rPr>
           <w:rFonts w:ascii="Times New Roman" w:cs="Times New Roman" w:eastAsia="Times New Roman" w:hAnsi="Times New Roman"/>
@@ -1209,7 +1209,7 @@
         </w:pBdr>
         <w:shd w:fill="auto" w:val="clear"/>
         <w:spacing w:after="0" w:before="0" w:line="240" w:lineRule="auto"/>
-        <w:ind w:left="288" w:right="0" w:firstLine="0"/>
+        <w:ind w:left="-283" w:right="283" w:firstLine="0"/>
         <w:jc w:val="center"/>
         <w:rPr>
           <w:rFonts w:ascii="Times New Roman" w:cs="Times New Roman" w:eastAsia="Times New Roman" w:hAnsi="Times New Roman"/>
@@ -1954,7 +1954,7 @@
         <w:tabs>
           <w:tab w:val="left" w:leader="none" w:pos="5949"/>
         </w:tabs>
-        <w:ind w:firstLine="288"/>
+        <w:ind w:left="-283" w:right="283" w:firstLine="0"/>
         <w:jc w:val="center"/>
         <w:rPr>
           <w:sz w:val="28"/>
@@ -1979,7 +1979,7 @@
         <w:tabs>
           <w:tab w:val="left" w:leader="none" w:pos="5949"/>
         </w:tabs>
-        <w:ind w:firstLine="288"/>
+        <w:ind w:left="-283" w:right="283" w:firstLine="0"/>
         <w:jc w:val="center"/>
         <w:rPr>
           <w:sz w:val="28"/>
@@ -2039,7 +2039,7 @@
     </w:p>
     <w:p>
       <w:pPr>
-        <w:ind w:firstLine="288"/>
+        <w:ind w:left="-283" w:right="283" w:firstLine="0"/>
         <w:jc w:val="center"/>
         <w:rPr>
           <w:b w:val="1"/>
@@ -2120,7 +2120,7 @@
         </w:pBdr>
         <w:shd w:fill="auto" w:val="clear"/>
         <w:spacing w:after="0" w:before="0" w:line="240" w:lineRule="auto"/>
-        <w:ind w:left="288" w:right="0" w:firstLine="0"/>
+        <w:ind w:left="-283" w:right="283" w:firstLine="0"/>
         <w:jc w:val="center"/>
         <w:rPr>
           <w:rFonts w:ascii="Times New Roman" w:cs="Times New Roman" w:eastAsia="Times New Roman" w:hAnsi="Times New Roman"/>
@@ -2172,7 +2172,7 @@
         </w:pBdr>
         <w:shd w:fill="auto" w:val="clear"/>
         <w:spacing w:after="0" w:before="0" w:line="240" w:lineRule="auto"/>
-        <w:ind w:left="288" w:right="0" w:firstLine="0"/>
+        <w:ind w:left="-283" w:right="283" w:firstLine="0"/>
         <w:jc w:val="center"/>
         <w:rPr>
           <w:rFonts w:ascii="Times New Roman" w:cs="Times New Roman" w:eastAsia="Times New Roman" w:hAnsi="Times New Roman"/>
@@ -2224,7 +2224,7 @@
         </w:pBdr>
         <w:shd w:fill="auto" w:val="clear"/>
         <w:spacing w:after="0" w:before="0" w:line="240" w:lineRule="auto"/>
-        <w:ind w:left="288" w:right="0" w:firstLine="0"/>
+        <w:ind w:left="-283" w:right="283" w:firstLine="0"/>
         <w:jc w:val="center"/>
         <w:rPr>
           <w:rFonts w:ascii="Times New Roman" w:cs="Times New Roman" w:eastAsia="Times New Roman" w:hAnsi="Times New Roman"/>
@@ -2574,7 +2574,7 @@
     <w:p>
       <w:pPr>
         <w:spacing w:before="0" w:after="0" w:line="240" w:lineRule="auto"/>
-        <w:ind w:left="709" w:right="709" w:firstLine="0"/>
+        <w:ind w:left="425" w:right="992" w:firstLine="0"/>
         <w:jc w:val="center"/>
         <w:rPr>
           <w:b w:val="1"/>
@@ -2599,24 +2599,36 @@
     </w:p>
     <w:p>
       <w:pPr>
+        <w:ind w:left="-283" w:right="283" w:firstLine="0"/>
+        <w:jc w:val="center"/>
+        <w:rPr>
+          <w:b w:val="1"/>
+          <w:bCs w:val="1"/>
+        </w:rPr>
+      </w:pPr>
+      <w:r>
+        <w:rPr>
+          <w:rFonts w:ascii="Times New Roman" w:hAnsi="Times New Roman" w:eastAsia="Times New Roman" w:cs="Times New Roman"/>
+          <w:b/>
+          <w:bCs w:val="1"/>
+          <w:i w:val="0"/>
+          <w:color w:val="000000"/>
+          <w:sz w:val="24"/>
+          <w:rtl w:val="0"/>
+        </w:rPr>
+        <w:t xml:space="preserve">Orientador</w:t>
+      </w:r>
+    </w:p>
+    <w:p>
+      <w:pPr>
         <w:ind w:firstLine="288"/>
         <w:jc w:val="center"/>
-        <w:rPr>
-          <w:b w:val="1"/>
-          <w:bCs w:val="1"/>
-        </w:rPr>
-      </w:pPr>
-      <w:r>
-        <w:rPr>
-          <w:rFonts w:ascii="Times New Roman" w:hAnsi="Times New Roman" w:eastAsia="Times New Roman" w:cs="Times New Roman"/>
-          <w:b/>
-          <w:bCs w:val="1"/>
-          <w:i w:val="0"/>
-          <w:color w:val="000000"/>
-          <w:sz w:val="24"/>
-          <w:rtl w:val="0"/>
-        </w:rPr>
-        <w:t xml:space="preserve">Orientador</w:t>
+        <w:rPr/>
+      </w:pPr>
+      <w:r>
+        <w:rPr>
+          <w:rtl w:val="0"/>
+        </w:rPr>
       </w:r>
     </w:p>
     <w:p>
@@ -2633,20 +2645,8 @@
     </w:p>
     <w:p>
       <w:pPr>
-        <w:ind w:firstLine="288"/>
-        <w:jc w:val="center"/>
-        <w:rPr/>
-      </w:pPr>
-      <w:r>
-        <w:rPr>
-          <w:rtl w:val="0"/>
-        </w:rPr>
-      </w:r>
-    </w:p>
-    <w:p>
-      <w:pPr>
         <w:spacing w:before="0" w:after="0" w:line="240" w:lineRule="auto"/>
-        <w:ind w:left="709" w:right="709" w:firstLine="0"/>
+        <w:ind w:left="425" w:right="992" w:firstLine="0"/>
         <w:jc w:val="center"/>
         <w:rPr>
           <w:b w:val="1"/>
@@ -2671,42 +2671,42 @@
     </w:p>
     <w:p>
       <w:pPr>
+        <w:ind w:left="-283" w:right="283" w:firstLine="0"/>
+        <w:jc w:val="center"/>
+        <w:rPr>
+          <w:b w:val="1"/>
+          <w:bCs w:val="1"/>
+        </w:rPr>
+      </w:pPr>
+      <w:r>
+        <w:rPr>
+          <w:rFonts w:ascii="Times New Roman" w:hAnsi="Times New Roman" w:eastAsia="Times New Roman" w:cs="Times New Roman"/>
+          <w:b/>
+          <w:bCs w:val="1"/>
+          <w:i w:val="0"/>
+          <w:color w:val="000000"/>
+          <w:sz w:val="24"/>
+          <w:rtl w:val="0"/>
+        </w:rPr>
+        <w:t xml:space="preserve">Coorientador se aplicável</w:t>
+      </w:r>
+    </w:p>
+    <w:p>
+      <w:pPr>
         <w:ind w:firstLine="288"/>
         <w:jc w:val="center"/>
-        <w:rPr>
-          <w:b w:val="1"/>
-          <w:bCs w:val="1"/>
-        </w:rPr>
-      </w:pPr>
-      <w:r>
-        <w:rPr>
-          <w:rFonts w:ascii="Times New Roman" w:hAnsi="Times New Roman" w:eastAsia="Times New Roman" w:cs="Times New Roman"/>
-          <w:b/>
-          <w:bCs w:val="1"/>
-          <w:i w:val="0"/>
-          <w:color w:val="000000"/>
-          <w:sz w:val="24"/>
-          <w:rtl w:val="0"/>
-        </w:rPr>
-        <w:t xml:space="preserve">Coorientador se aplicável</w:t>
+        <w:rPr/>
+      </w:pPr>
+      <w:r>
+        <w:rPr>
+          <w:rtl w:val="0"/>
+        </w:rPr>
       </w:r>
     </w:p>
     <w:p>
       <w:pPr>
         <w:ind w:firstLine="288"/>
         <w:jc w:val="center"/>
-        <w:rPr/>
-      </w:pPr>
-      <w:r>
-        <w:rPr>
-          <w:rtl w:val="0"/>
-        </w:rPr>
-      </w:r>
-    </w:p>
-    <w:p>
-      <w:pPr>
-        <w:ind w:firstLine="288"/>
-        <w:jc w:val="center"/>
         <w:rPr>
           <w:b w:val="1"/>
           <w:bCs w:val="1"/>
@@ -2721,7 +2721,7 @@
     <w:p>
       <w:pPr>
         <w:spacing w:before="0" w:after="0" w:line="240" w:lineRule="auto"/>
-        <w:ind w:left="709" w:right="709" w:firstLine="0"/>
+        <w:ind w:left="425" w:right="992" w:firstLine="0"/>
         <w:jc w:val="center"/>
         <w:rPr>
           <w:b w:val="1"/>
@@ -2746,42 +2746,42 @@
     </w:p>
     <w:p>
       <w:pPr>
+        <w:ind w:left="-283" w:right="283" w:firstLine="0"/>
+        <w:jc w:val="center"/>
+        <w:rPr>
+          <w:b w:val="1"/>
+          <w:bCs w:val="1"/>
+        </w:rPr>
+      </w:pPr>
+      <w:r>
+        <w:rPr>
+          <w:rFonts w:ascii="Times New Roman" w:hAnsi="Times New Roman" w:eastAsia="Times New Roman" w:cs="Times New Roman"/>
+          <w:b/>
+          <w:bCs w:val="1"/>
+          <w:i w:val="0"/>
+          <w:color w:val="000000"/>
+          <w:sz w:val="24"/>
+          <w:rtl w:val="0"/>
+        </w:rPr>
+        <w:t xml:space="preserve">Componente da banca</w:t>
+      </w:r>
+    </w:p>
+    <w:p>
+      <w:pPr>
         <w:ind w:firstLine="288"/>
         <w:jc w:val="center"/>
-        <w:rPr>
-          <w:b w:val="1"/>
-          <w:bCs w:val="1"/>
-        </w:rPr>
-      </w:pPr>
-      <w:r>
-        <w:rPr>
-          <w:rFonts w:ascii="Times New Roman" w:hAnsi="Times New Roman" w:eastAsia="Times New Roman" w:cs="Times New Roman"/>
-          <w:b/>
-          <w:bCs w:val="1"/>
-          <w:i w:val="0"/>
-          <w:color w:val="000000"/>
-          <w:sz w:val="24"/>
-          <w:rtl w:val="0"/>
-        </w:rPr>
-        <w:t xml:space="preserve">Componente da banca</w:t>
+        <w:rPr/>
+      </w:pPr>
+      <w:r>
+        <w:rPr>
+          <w:rtl w:val="0"/>
+        </w:rPr>
       </w:r>
     </w:p>
     <w:p>
       <w:pPr>
         <w:ind w:firstLine="288"/>
         <w:jc w:val="center"/>
-        <w:rPr/>
-      </w:pPr>
-      <w:r>
-        <w:rPr>
-          <w:rtl w:val="0"/>
-        </w:rPr>
-      </w:r>
-    </w:p>
-    <w:p>
-      <w:pPr>
-        <w:ind w:firstLine="288"/>
-        <w:jc w:val="center"/>
         <w:rPr>
           <w:b w:val="1"/>
           <w:bCs w:val="1"/>
@@ -2796,7 +2796,7 @@
     <w:p>
       <w:pPr>
         <w:spacing w:before="0" w:after="0" w:line="240" w:lineRule="auto"/>
-        <w:ind w:left="709" w:right="709" w:firstLine="0"/>
+        <w:ind w:left="425" w:right="992" w:firstLine="0"/>
         <w:jc w:val="center"/>
         <w:rPr>
           <w:b w:val="1"/>
@@ -2821,6 +2821,28 @@
     </w:p>
     <w:p>
       <w:pPr>
+        <w:ind w:left="-283" w:right="283" w:firstLine="0"/>
+        <w:jc w:val="center"/>
+        <w:rPr>
+          <w:b w:val="1"/>
+          <w:bCs w:val="1"/>
+        </w:rPr>
+      </w:pPr>
+      <w:r>
+        <w:rPr>
+          <w:rFonts w:ascii="Times New Roman" w:hAnsi="Times New Roman" w:eastAsia="Times New Roman" w:cs="Times New Roman"/>
+          <w:b/>
+          <w:bCs w:val="1"/>
+          <w:i w:val="0"/>
+          <w:color w:val="000000"/>
+          <w:sz w:val="24"/>
+          <w:rtl w:val="0"/>
+        </w:rPr>
+        <w:t xml:space="preserve">Componente da banca</w:t>
+      </w:r>
+    </w:p>
+    <w:p>
+      <w:pPr>
         <w:ind w:firstLine="288"/>
         <w:jc w:val="center"/>
         <w:rPr>
@@ -2830,15 +2852,8 @@
       </w:pPr>
       <w:r>
         <w:rPr>
-          <w:rFonts w:ascii="Times New Roman" w:hAnsi="Times New Roman" w:eastAsia="Times New Roman" w:cs="Times New Roman"/>
-          <w:b/>
-          <w:bCs w:val="1"/>
-          <w:i w:val="0"/>
-          <w:color w:val="000000"/>
-          <w:sz w:val="24"/>
-          <w:rtl w:val="0"/>
-        </w:rPr>
-        <w:t xml:space="preserve">Componente da banca</w:t>
+          <w:rtl w:val="0"/>
+        </w:rPr>
       </w:r>
     </w:p>
     <w:p>
@@ -2888,6 +2903,28 @@
     </w:p>
     <w:p>
       <w:pPr>
+        <w:ind w:left="-283" w:right="283" w:firstLine="0"/>
+        <w:jc w:val="center"/>
+        <w:rPr>
+          <w:b w:val="1"/>
+          <w:bCs w:val="1"/>
+        </w:rPr>
+      </w:pPr>
+      <w:r>
+        <w:rPr>
+          <w:rFonts w:ascii="Times New Roman" w:hAnsi="Times New Roman" w:eastAsia="Times New Roman" w:cs="Times New Roman"/>
+          <w:b w:val="0"/>
+          <w:bCs w:val="1"/>
+          <w:i w:val="0"/>
+          <w:color w:val="000000"/>
+          <w:sz w:val="24"/>
+          <w:rtl w:val="0"/>
+        </w:rPr>
+        <w:t xml:space="preserve">_____/_____/_____</w:t>
+      </w:r>
+    </w:p>
+    <w:p>
+      <w:pPr>
         <w:ind w:firstLine="288"/>
         <w:jc w:val="center"/>
         <w:rPr>
@@ -2903,44 +2940,7 @@
     </w:p>
     <w:p>
       <w:pPr>
-        <w:ind w:firstLine="288"/>
-        <w:jc w:val="center"/>
-        <w:rPr>
-          <w:b w:val="1"/>
-          <w:bCs w:val="1"/>
-        </w:rPr>
-      </w:pPr>
-      <w:r>
-        <w:rPr>
-          <w:rFonts w:ascii="Times New Roman" w:hAnsi="Times New Roman" w:eastAsia="Times New Roman" w:cs="Times New Roman"/>
-          <w:b w:val="0"/>
-          <w:bCs w:val="1"/>
-          <w:i w:val="0"/>
-          <w:color w:val="000000"/>
-          <w:sz w:val="24"/>
-          <w:rtl w:val="0"/>
-        </w:rPr>
-        <w:t xml:space="preserve">_____/_____/_____</w:t>
-      </w:r>
-    </w:p>
-    <w:p>
-      <w:pPr>
-        <w:ind w:firstLine="288"/>
-        <w:jc w:val="center"/>
-        <w:rPr>
-          <w:b w:val="1"/>
-          <w:bCs w:val="1"/>
-        </w:rPr>
-      </w:pPr>
-      <w:r>
-        <w:rPr>
-          <w:rtl w:val="0"/>
-        </w:rPr>
-      </w:r>
-    </w:p>
-    <w:p>
-      <w:pPr>
-        <w:ind w:firstLine="288"/>
+        <w:ind w:left="-283" w:right="283" w:firstLine="0"/>
         <w:jc w:val="center"/>
         <w:rPr>
           <w:b w:val="1"/>

</xml_diff>

<commit_message>
Centraliza elementos pelo meio físico da página
</commit_message>
<xml_diff>
--- a/docs/Portfolio_TG_William_Honda.docx
+++ b/docs/Portfolio_TG_William_Honda.docx
@@ -4,8 +4,11 @@
   <w:body>
     <w:p>
       <w:pPr>
-        <w:ind w:left="-283" w:right="283" w:firstLine="0"/>
-        <w:jc w:val="center"/>
+        <w:tabs>
+          <w:tab w:pos="4252" w:val="center"/>
+        </w:tabs>
+        <w:ind w:left="0" w:right="0" w:firstLine="0"/>
+        <w:jc w:val="left"/>
         <w:rPr>
           <w:b w:val="1"/>
           <w:bCs w:val="1"/>
@@ -26,13 +29,17 @@
           <w:szCs w:val="28"/>
           <w:rtl w:val="0"/>
         </w:rPr>
-        <w:t xml:space="preserve">FACULDADE DE TECNOLOGIA DE SÃO JOSÉ DOS CAMPOS</w:t>
-      </w:r>
-    </w:p>
-    <w:p>
-      <w:pPr>
-        <w:ind w:left="-283" w:right="283" w:firstLine="0"/>
-        <w:jc w:val="center"/>
+        <w:tab/>
+        <w:t>FACULDADE DE TECNOLOGIA DE SÃO JOSÉ DOS CAMPOS</w:t>
+      </w:r>
+    </w:p>
+    <w:p>
+      <w:pPr>
+        <w:tabs>
+          <w:tab w:pos="4252" w:val="center"/>
+        </w:tabs>
+        <w:ind w:left="0" w:right="0" w:firstLine="0"/>
+        <w:jc w:val="left"/>
         <w:rPr>
           <w:b w:val="1"/>
           <w:bCs w:val="1"/>
@@ -51,7 +58,8 @@
           <w:szCs w:val="28"/>
           <w:rtl w:val="0"/>
         </w:rPr>
-        <w:t xml:space="preserve">FATEC PROFESSOR JESSEN VIDAL</w:t>
+        <w:tab/>
+        <w:t>FATEC PROFESSOR JESSEN VIDAL</w:t>
       </w:r>
       <w:r>
         <w:rPr>
@@ -189,8 +197,11 @@
     </w:p>
     <w:p>
       <w:pPr>
-        <w:ind w:left="-283" w:right="283" w:firstLine="0"/>
-        <w:jc w:val="center"/>
+        <w:tabs>
+          <w:tab w:pos="4252" w:val="center"/>
+        </w:tabs>
+        <w:ind w:left="0" w:right="0" w:firstLine="0"/>
+        <w:jc w:val="left"/>
         <w:rPr>
           <w:b w:val="1"/>
           <w:bCs w:val="1"/>
@@ -207,7 +218,8 @@
           <w:szCs w:val="28"/>
           <w:rtl w:val="0"/>
         </w:rPr>
-        <w:t xml:space="preserve">WILLIAM HONDA</w:t>
+        <w:tab/>
+        <w:t>WILLIAM HONDA</w:t>
       </w:r>
       <w:r>
         <w:rPr>
@@ -373,9 +385,12 @@
           <w:between w:space="0" w:sz="0" w:val="nil"/>
         </w:pBdr>
         <w:shd w:fill="auto" w:val="clear"/>
+        <w:tabs>
+          <w:tab w:pos="4252" w:val="center"/>
+        </w:tabs>
         <w:spacing w:after="0" w:before="0" w:line="240" w:lineRule="auto"/>
-        <w:ind w:left="-283" w:right="283" w:firstLine="0"/>
-        <w:jc w:val="center"/>
+        <w:ind w:left="0" w:right="0" w:firstLine="0"/>
+        <w:jc w:val="left"/>
         <w:rPr>
           <w:rFonts w:ascii="Times New Roman" w:cs="Times New Roman" w:eastAsia="Times New Roman" w:hAnsi="Times New Roman"/>
           <w:b w:val="1"/>
@@ -408,7 +423,8 @@
           <w:vertAlign w:val="baseline"/>
           <w:rtl w:val="0"/>
         </w:rPr>
-        <w:t xml:space="preserve">PORTFÓLIO DE APRENDIZAGEM DE</w:t>
+        <w:tab/>
+        <w:t>PORTFÓLIO DE APRENDIZAGEM DE</w:t>
       </w:r>
     </w:p>
     <w:p>
@@ -425,9 +441,12 @@
           <w:between w:space="0" w:sz="0" w:val="nil"/>
         </w:pBdr>
         <w:shd w:fill="auto" w:val="clear"/>
+        <w:tabs>
+          <w:tab w:pos="4252" w:val="center"/>
+        </w:tabs>
         <w:spacing w:after="0" w:before="0" w:line="240" w:lineRule="auto"/>
-        <w:ind w:left="-283" w:right="283" w:firstLine="0"/>
-        <w:jc w:val="center"/>
+        <w:ind w:left="0" w:right="0" w:firstLine="0"/>
+        <w:jc w:val="left"/>
         <w:rPr>
           <w:rFonts w:ascii="Times New Roman" w:cs="Times New Roman" w:eastAsia="Times New Roman" w:hAnsi="Times New Roman"/>
           <w:b w:val="1"/>
@@ -460,7 +479,8 @@
           <w:vertAlign w:val="baseline"/>
           <w:rtl w:val="0"/>
         </w:rPr>
-        <w:t xml:space="preserve">PROJETOS INTEGRADOS API</w:t>
+        <w:tab/>
+        <w:t>PROJETOS INTEGRADOS API</w:t>
       </w:r>
     </w:p>
     <w:p>
@@ -477,9 +497,12 @@
           <w:between w:space="0" w:sz="0" w:val="nil"/>
         </w:pBdr>
         <w:shd w:fill="auto" w:val="clear"/>
+        <w:tabs>
+          <w:tab w:pos="4252" w:val="center"/>
+        </w:tabs>
         <w:spacing w:after="0" w:before="0" w:line="240" w:lineRule="auto"/>
-        <w:ind w:left="-283" w:right="283" w:firstLine="0"/>
-        <w:jc w:val="center"/>
+        <w:ind w:left="0" w:right="0" w:firstLine="0"/>
+        <w:jc w:val="left"/>
         <w:rPr>
           <w:rFonts w:ascii="Times New Roman" w:cs="Times New Roman" w:eastAsia="Times New Roman" w:hAnsi="Times New Roman"/>
           <w:b w:val="1"/>
@@ -512,7 +535,8 @@
           <w:vertAlign w:val="baseline"/>
           <w:rtl w:val="0"/>
         </w:rPr>
-        <w:t xml:space="preserve">TRACKER SISTEMA DE GESTÃO DE MANUTENÇÕES</w:t>
+        <w:tab/>
+        <w:t>TRACKER SISTEMA DE GESTÃO DE MANUTENÇÕES</w:t>
       </w:r>
       <w:r>
         <w:rPr>
@@ -856,10 +880,10 @@
     <w:p>
       <w:pPr>
         <w:tabs>
-          <w:tab w:val="left" w:leader="none" w:pos="5949"/>
+          <w:tab w:pos="4252" w:val="center"/>
         </w:tabs>
-        <w:ind w:left="-283" w:right="283" w:firstLine="0"/>
-        <w:jc w:val="center"/>
+        <w:ind w:left="0" w:right="0" w:firstLine="0"/>
+        <w:jc w:val="left"/>
         <w:rPr>
           <w:sz w:val="28"/>
           <w:szCs w:val="28"/>
@@ -875,16 +899,17 @@
           <w:szCs w:val="28"/>
           <w:rtl w:val="0"/>
         </w:rPr>
-        <w:t xml:space="preserve">São José dos Campos</w:t>
+        <w:tab/>
+        <w:t>São José dos Campos</w:t>
       </w:r>
     </w:p>
     <w:p>
       <w:pPr>
         <w:tabs>
-          <w:tab w:val="left" w:leader="none" w:pos="5949"/>
+          <w:tab w:pos="4252" w:val="center"/>
         </w:tabs>
-        <w:ind w:left="-283" w:right="283" w:firstLine="0"/>
-        <w:jc w:val="center"/>
+        <w:ind w:left="0" w:right="0" w:firstLine="0"/>
+        <w:jc w:val="left"/>
         <w:rPr>
           <w:sz w:val="28"/>
           <w:szCs w:val="28"/>
@@ -900,7 +925,8 @@
           <w:szCs w:val="28"/>
           <w:rtl w:val="0"/>
         </w:rPr>
-        <w:t xml:space="preserve">2026</w:t>
+        <w:tab/>
+        <w:t>2026</w:t>
       </w:r>
       <w:r>
         <w:rPr>
@@ -964,8 +990,11 @@
     </w:p>
     <w:p>
       <w:pPr>
-        <w:ind w:left="-283" w:right="283" w:firstLine="0"/>
-        <w:jc w:val="center"/>
+        <w:tabs>
+          <w:tab w:pos="4252" w:val="center"/>
+        </w:tabs>
+        <w:ind w:left="0" w:right="0" w:firstLine="0"/>
+        <w:jc w:val="left"/>
         <w:rPr>
           <w:b w:val="1"/>
           <w:bCs w:val="1"/>
@@ -984,8 +1013,9 @@
           <w:szCs w:val="28"/>
           <w:rtl w:val="0"/>
         </w:rPr>
-        <w:t xml:space="preserve">WILLIAM HONDA</w:t>
-        <w:br w:type="textWrapping"/>
+        <w:tab/>
+        <w:t>WILLIAM HONDA</w:t>
+        <w:br/>
       </w:r>
     </w:p>
     <w:p>
@@ -1104,9 +1134,12 @@
           <w:between w:space="0" w:sz="0" w:val="nil"/>
         </w:pBdr>
         <w:shd w:fill="auto" w:val="clear"/>
+        <w:tabs>
+          <w:tab w:pos="4252" w:val="center"/>
+        </w:tabs>
         <w:spacing w:after="0" w:before="0" w:line="240" w:lineRule="auto"/>
-        <w:ind w:left="-283" w:right="283" w:firstLine="0"/>
-        <w:jc w:val="center"/>
+        <w:ind w:left="0" w:right="0" w:firstLine="0"/>
+        <w:jc w:val="left"/>
         <w:rPr>
           <w:rFonts w:ascii="Times New Roman" w:cs="Times New Roman" w:eastAsia="Times New Roman" w:hAnsi="Times New Roman"/>
           <w:b w:val="1"/>
@@ -1139,7 +1172,8 @@
           <w:vertAlign w:val="baseline"/>
           <w:rtl w:val="0"/>
         </w:rPr>
-        <w:t xml:space="preserve">PORTFÓLIO DE APRENDIZAGEM DE</w:t>
+        <w:tab/>
+        <w:t>PORTFÓLIO DE APRENDIZAGEM DE</w:t>
       </w:r>
     </w:p>
     <w:p>
@@ -1156,9 +1190,12 @@
           <w:between w:space="0" w:sz="0" w:val="nil"/>
         </w:pBdr>
         <w:shd w:fill="auto" w:val="clear"/>
+        <w:tabs>
+          <w:tab w:pos="4252" w:val="center"/>
+        </w:tabs>
         <w:spacing w:after="0" w:before="0" w:line="240" w:lineRule="auto"/>
-        <w:ind w:left="-283" w:right="283" w:firstLine="0"/>
-        <w:jc w:val="center"/>
+        <w:ind w:left="0" w:right="0" w:firstLine="0"/>
+        <w:jc w:val="left"/>
         <w:rPr>
           <w:rFonts w:ascii="Times New Roman" w:cs="Times New Roman" w:eastAsia="Times New Roman" w:hAnsi="Times New Roman"/>
           <w:b w:val="1"/>
@@ -1191,7 +1228,8 @@
           <w:vertAlign w:val="baseline"/>
           <w:rtl w:val="0"/>
         </w:rPr>
-        <w:t xml:space="preserve">PROJETOS INTEGRADOS API</w:t>
+        <w:tab/>
+        <w:t>PROJETOS INTEGRADOS API</w:t>
       </w:r>
     </w:p>
     <w:p>
@@ -1208,9 +1246,12 @@
           <w:between w:space="0" w:sz="0" w:val="nil"/>
         </w:pBdr>
         <w:shd w:fill="auto" w:val="clear"/>
+        <w:tabs>
+          <w:tab w:pos="4252" w:val="center"/>
+        </w:tabs>
         <w:spacing w:after="0" w:before="0" w:line="240" w:lineRule="auto"/>
-        <w:ind w:left="-283" w:right="283" w:firstLine="0"/>
-        <w:jc w:val="center"/>
+        <w:ind w:left="0" w:right="0" w:firstLine="0"/>
+        <w:jc w:val="left"/>
         <w:rPr>
           <w:rFonts w:ascii="Times New Roman" w:cs="Times New Roman" w:eastAsia="Times New Roman" w:hAnsi="Times New Roman"/>
           <w:b w:val="1"/>
@@ -1243,7 +1284,8 @@
           <w:vertAlign w:val="baseline"/>
           <w:rtl w:val="0"/>
         </w:rPr>
-        <w:t xml:space="preserve">TRACKER SISTEMA DE GESTÃO DE MANUTENÇÕES</w:t>
+        <w:tab/>
+        <w:t>TRACKER SISTEMA DE GESTÃO DE MANUTENÇÕES</w:t>
       </w:r>
     </w:p>
     <w:p>
@@ -1952,10 +1994,10 @@
     <w:p>
       <w:pPr>
         <w:tabs>
-          <w:tab w:val="left" w:leader="none" w:pos="5949"/>
+          <w:tab w:pos="4252" w:val="center"/>
         </w:tabs>
-        <w:ind w:left="-283" w:right="283" w:firstLine="0"/>
-        <w:jc w:val="center"/>
+        <w:ind w:left="0" w:right="0" w:firstLine="0"/>
+        <w:jc w:val="left"/>
         <w:rPr>
           <w:sz w:val="28"/>
           <w:szCs w:val="28"/>
@@ -1971,16 +2013,17 @@
           <w:szCs w:val="28"/>
           <w:rtl w:val="0"/>
         </w:rPr>
-        <w:t xml:space="preserve">São José dos Campos</w:t>
+        <w:tab/>
+        <w:t>São José dos Campos</w:t>
       </w:r>
     </w:p>
     <w:p>
       <w:pPr>
         <w:tabs>
-          <w:tab w:val="left" w:leader="none" w:pos="5949"/>
+          <w:tab w:pos="4252" w:val="center"/>
         </w:tabs>
-        <w:ind w:left="-283" w:right="283" w:firstLine="0"/>
-        <w:jc w:val="center"/>
+        <w:ind w:left="0" w:right="0" w:firstLine="0"/>
+        <w:jc w:val="left"/>
         <w:rPr>
           <w:sz w:val="28"/>
           <w:szCs w:val="28"/>
@@ -2003,7 +2046,8 @@
           <w:szCs w:val="28"/>
           <w:rtl w:val="0"/>
         </w:rPr>
-        <w:t xml:space="preserve">2026</w:t>
+        <w:tab/>
+        <w:t>2026</w:t>
       </w:r>
       <w:r>
         <w:rPr>
@@ -2039,8 +2083,11 @@
     </w:p>
     <w:p>
       <w:pPr>
-        <w:ind w:left="-283" w:right="283" w:firstLine="0"/>
-        <w:jc w:val="center"/>
+        <w:tabs>
+          <w:tab w:pos="4252" w:val="center"/>
+        </w:tabs>
+        <w:ind w:left="0" w:right="0" w:firstLine="0"/>
+        <w:jc w:val="left"/>
         <w:rPr>
           <w:b w:val="1"/>
           <w:bCs w:val="1"/>
@@ -2059,8 +2106,9 @@
           <w:szCs w:val="28"/>
           <w:rtl w:val="0"/>
         </w:rPr>
-        <w:t xml:space="preserve">WILLIAM HONDA</w:t>
-        <w:br w:type="textWrapping"/>
+        <w:tab/>
+        <w:t>WILLIAM HONDA</w:t>
+        <w:br/>
       </w:r>
     </w:p>
     <w:p>
@@ -2119,9 +2167,12 @@
           <w:between w:space="0" w:sz="0" w:val="nil"/>
         </w:pBdr>
         <w:shd w:fill="auto" w:val="clear"/>
+        <w:tabs>
+          <w:tab w:pos="4252" w:val="center"/>
+        </w:tabs>
         <w:spacing w:after="0" w:before="0" w:line="240" w:lineRule="auto"/>
-        <w:ind w:left="-283" w:right="283" w:firstLine="0"/>
-        <w:jc w:val="center"/>
+        <w:ind w:left="0" w:right="0" w:firstLine="0"/>
+        <w:jc w:val="left"/>
         <w:rPr>
           <w:rFonts w:ascii="Times New Roman" w:cs="Times New Roman" w:eastAsia="Times New Roman" w:hAnsi="Times New Roman"/>
           <w:b w:val="1"/>
@@ -2154,7 +2205,8 @@
           <w:vertAlign w:val="baseline"/>
           <w:rtl w:val="0"/>
         </w:rPr>
-        <w:t xml:space="preserve">PORTFÓLIO DE APRENDIZAGEM DE</w:t>
+        <w:tab/>
+        <w:t>PORTFÓLIO DE APRENDIZAGEM DE</w:t>
       </w:r>
     </w:p>
     <w:p>
@@ -2171,9 +2223,12 @@
           <w:between w:space="0" w:sz="0" w:val="nil"/>
         </w:pBdr>
         <w:shd w:fill="auto" w:val="clear"/>
+        <w:tabs>
+          <w:tab w:pos="4252" w:val="center"/>
+        </w:tabs>
         <w:spacing w:after="0" w:before="0" w:line="240" w:lineRule="auto"/>
-        <w:ind w:left="-283" w:right="283" w:firstLine="0"/>
-        <w:jc w:val="center"/>
+        <w:ind w:left="0" w:right="0" w:firstLine="0"/>
+        <w:jc w:val="left"/>
         <w:rPr>
           <w:rFonts w:ascii="Times New Roman" w:cs="Times New Roman" w:eastAsia="Times New Roman" w:hAnsi="Times New Roman"/>
           <w:b w:val="1"/>
@@ -2206,7 +2261,8 @@
           <w:vertAlign w:val="baseline"/>
           <w:rtl w:val="0"/>
         </w:rPr>
-        <w:t xml:space="preserve">PROJETOS INTEGRADOS API</w:t>
+        <w:tab/>
+        <w:t>PROJETOS INTEGRADOS API</w:t>
       </w:r>
     </w:p>
     <w:p>
@@ -2223,9 +2279,12 @@
           <w:between w:space="0" w:sz="0" w:val="nil"/>
         </w:pBdr>
         <w:shd w:fill="auto" w:val="clear"/>
+        <w:tabs>
+          <w:tab w:pos="4252" w:val="center"/>
+        </w:tabs>
         <w:spacing w:after="0" w:before="0" w:line="240" w:lineRule="auto"/>
-        <w:ind w:left="-283" w:right="283" w:firstLine="0"/>
-        <w:jc w:val="center"/>
+        <w:ind w:left="0" w:right="0" w:firstLine="0"/>
+        <w:jc w:val="left"/>
         <w:rPr>
           <w:rFonts w:ascii="Times New Roman" w:cs="Times New Roman" w:eastAsia="Times New Roman" w:hAnsi="Times New Roman"/>
           <w:b w:val="1"/>
@@ -2258,7 +2317,8 @@
           <w:vertAlign w:val="baseline"/>
           <w:rtl w:val="0"/>
         </w:rPr>
-        <w:t xml:space="preserve">TRACKER SISTEMA DE GESTÃO DE MANUTENÇÕES</w:t>
+        <w:tab/>
+        <w:t>TRACKER SISTEMA DE GESTÃO DE MANUTENÇÕES</w:t>
       </w:r>
     </w:p>
     <w:p>
@@ -2599,8 +2659,11 @@
     </w:p>
     <w:p>
       <w:pPr>
-        <w:ind w:left="-283" w:right="283" w:firstLine="0"/>
-        <w:jc w:val="center"/>
+        <w:tabs>
+          <w:tab w:pos="4252" w:val="center"/>
+        </w:tabs>
+        <w:ind w:left="0" w:right="0" w:firstLine="0"/>
+        <w:jc w:val="left"/>
         <w:rPr>
           <w:b w:val="1"/>
           <w:bCs w:val="1"/>
@@ -2616,7 +2679,8 @@
           <w:sz w:val="24"/>
           <w:rtl w:val="0"/>
         </w:rPr>
-        <w:t xml:space="preserve">Orientador</w:t>
+        <w:tab/>
+        <w:t>Orientador</w:t>
       </w:r>
     </w:p>
     <w:p>
@@ -2671,8 +2735,11 @@
     </w:p>
     <w:p>
       <w:pPr>
-        <w:ind w:left="-283" w:right="283" w:firstLine="0"/>
-        <w:jc w:val="center"/>
+        <w:tabs>
+          <w:tab w:pos="4252" w:val="center"/>
+        </w:tabs>
+        <w:ind w:left="0" w:right="0" w:firstLine="0"/>
+        <w:jc w:val="left"/>
         <w:rPr>
           <w:b w:val="1"/>
           <w:bCs w:val="1"/>
@@ -2688,7 +2755,8 @@
           <w:sz w:val="24"/>
           <w:rtl w:val="0"/>
         </w:rPr>
-        <w:t xml:space="preserve">Coorientador se aplicável</w:t>
+        <w:tab/>
+        <w:t>Coorientador se aplicável</w:t>
       </w:r>
     </w:p>
     <w:p>
@@ -2746,8 +2814,11 @@
     </w:p>
     <w:p>
       <w:pPr>
-        <w:ind w:left="-283" w:right="283" w:firstLine="0"/>
-        <w:jc w:val="center"/>
+        <w:tabs>
+          <w:tab w:pos="4252" w:val="center"/>
+        </w:tabs>
+        <w:ind w:left="0" w:right="0" w:firstLine="0"/>
+        <w:jc w:val="left"/>
         <w:rPr>
           <w:b w:val="1"/>
           <w:bCs w:val="1"/>
@@ -2763,7 +2834,8 @@
           <w:sz w:val="24"/>
           <w:rtl w:val="0"/>
         </w:rPr>
-        <w:t xml:space="preserve">Componente da banca</w:t>
+        <w:tab/>
+        <w:t>Componente da banca</w:t>
       </w:r>
     </w:p>
     <w:p>
@@ -2821,8 +2893,11 @@
     </w:p>
     <w:p>
       <w:pPr>
-        <w:ind w:left="-283" w:right="283" w:firstLine="0"/>
-        <w:jc w:val="center"/>
+        <w:tabs>
+          <w:tab w:pos="4252" w:val="center"/>
+        </w:tabs>
+        <w:ind w:left="0" w:right="0" w:firstLine="0"/>
+        <w:jc w:val="left"/>
         <w:rPr>
           <w:b w:val="1"/>
           <w:bCs w:val="1"/>
@@ -2838,7 +2913,8 @@
           <w:sz w:val="24"/>
           <w:rtl w:val="0"/>
         </w:rPr>
-        <w:t xml:space="preserve">Componente da banca</w:t>
+        <w:tab/>
+        <w:t>Componente da banca</w:t>
       </w:r>
     </w:p>
     <w:p>
@@ -2903,24 +2979,28 @@
     </w:p>
     <w:p>
       <w:pPr>
-        <w:ind w:left="-283" w:right="283" w:firstLine="0"/>
-        <w:jc w:val="center"/>
-        <w:rPr>
-          <w:b w:val="1"/>
-          <w:bCs w:val="1"/>
-        </w:rPr>
-      </w:pPr>
-      <w:r>
-        <w:rPr>
-          <w:rFonts w:ascii="Times New Roman" w:hAnsi="Times New Roman" w:eastAsia="Times New Roman" w:cs="Times New Roman"/>
-          <w:b w:val="0"/>
-          <w:bCs w:val="1"/>
-          <w:i w:val="0"/>
-          <w:color w:val="000000"/>
-          <w:sz w:val="24"/>
-          <w:rtl w:val="0"/>
-        </w:rPr>
-        <w:t xml:space="preserve">_____/_____/_____</w:t>
+        <w:tabs>
+          <w:tab w:pos="4252" w:val="center"/>
+        </w:tabs>
+        <w:ind w:left="0" w:right="0" w:firstLine="0"/>
+        <w:jc w:val="left"/>
+        <w:rPr>
+          <w:b w:val="1"/>
+          <w:bCs w:val="1"/>
+        </w:rPr>
+      </w:pPr>
+      <w:r>
+        <w:rPr>
+          <w:rFonts w:ascii="Times New Roman" w:hAnsi="Times New Roman" w:eastAsia="Times New Roman" w:cs="Times New Roman"/>
+          <w:b w:val="0"/>
+          <w:bCs w:val="1"/>
+          <w:i w:val="0"/>
+          <w:color w:val="000000"/>
+          <w:sz w:val="24"/>
+          <w:rtl w:val="0"/>
+        </w:rPr>
+        <w:tab/>
+        <w:t>_____/_____/_____</w:t>
       </w:r>
     </w:p>
     <w:p>
@@ -2940,8 +3020,11 @@
     </w:p>
     <w:p>
       <w:pPr>
-        <w:ind w:left="-283" w:right="283" w:firstLine="0"/>
-        <w:jc w:val="center"/>
+        <w:tabs>
+          <w:tab w:pos="4252" w:val="center"/>
+        </w:tabs>
+        <w:ind w:left="0" w:right="0" w:firstLine="0"/>
+        <w:jc w:val="left"/>
         <w:rPr>
           <w:b w:val="1"/>
           <w:bCs w:val="1"/>
@@ -2957,7 +3040,8 @@
           <w:sz w:val="24"/>
           <w:rtl w:val="0"/>
         </w:rPr>
-        <w:t xml:space="preserve">DATA DA APROVAÇÃO</w:t>
+        <w:tab/>
+        <w:t>DATA DA APROVAÇÃO</w:t>
       </w:r>
     </w:p>
     <w:p>

</xml_diff>